<commit_message>
Re-audit docs/02-03-04-06 and distributable manuals against real code (RUNBOOK 12.71)
Closes the last open finding not blocked by procurement or a user
decision: docs/02 (patent) and docs/04 (business) had no stale factual
claims. docs/03 falsely claimed standalone CAdES support for generic
files/batches (not built - matrix already lists it as out of scope).
docs/06 described Gateway CORS as a permanently open dev policy, stale
since RUNBOOK 12.31 closed it by default outside Development. The
integration manual's validator field catalog was missing
sellosDeArchivo/timestamp fields and the SDK flat shortcuts, both real
since RUNBOOK 12.70/12.67 - added via direct document.xml edit,
validated structurally.

Co-Authored-By: Claude Sonnet 5 <noreply@anthropic.com>
</commit_message>
<xml_diff>
--- a/docs/08-cumplimiento/manuales-distribuibles/SecureSign - Manual Tecnico de Integracion.docx
+++ b/docs/08-cumplimiento/manuales-distribuibles/SecureSign - Manual Tecnico de Integracion.docx
@@ -53,7 +53,7 @@
           <w:sz w:val="18"/>
           <w:szCs w:val="18"/>
         </w:rPr>
-        <w:t xml:space="preserve">Auditado contra el Gateway real y los controladores reales · Actualizado 2026-09-29</w:t>
+        <w:t xml:space="preserve">Auditado contra el Gateway real y los controladores reales · Actualizado 2026-10-01</w:t>
       </w:r>
     </w:p>
     <w:p>
@@ -2570,6 +2570,14 @@
         <w:spacing w:after="160"/>
       </w:pPr>
       <w:r>
+        <w:t xml:space="preserve">Los tres SDK también exponen atajos planos de un solo nivel (AutenticarAsync/EnviarDocumentoAsync/SolicitarFirmaAsync/ValidarFirmaAsync en .NET, y sus equivalentes en JavaScript/Python) que delegan directo en los métodos de recurso de arriba, sin lógica nueva — ver docs/05-integración/sdk/README.md para el detalle de ambos estilos y por qué coexisten.</w:t>
+      </w:r>
+    </w:p>
+    <w:p>
+      <w:pPr>
+        <w:spacing w:after="160"/>
+      </w:pPr>
+      <w:r>
         <w:t xml:space="preserve">Ejemplo mínimo (Python) — mismo flujo que firmar-documento.sh:</w:t>
       </w:r>
     </w:p>
@@ -3437,6 +3445,210 @@
                 <w:color w:val="000000"/>
               </w:rPr>
               <w:t xml:space="preserve">true solo si TODO lo anterior es verdadero, incluida revocación en Good.</w:t>
+            </w:r>
+          </w:p>
+        </w:tc>
+      </w:tr>
+      <w:tr>
+        <w:trPr>
+          <w:tblHeader w:val="false"/>
+        </w:trPr>
+        <w:tc>
+          <w:tcPr>
+            <w:tcW w:type="dxa" w:w="2200"/>
+            <w:tcMar>
+              <w:top w:type="dxa" w:w="90"/>
+              <w:left w:type="dxa" w:w="110"/>
+              <w:bottom w:type="dxa" w:w="90"/>
+              <w:right w:type="dxa" w:w="110"/>
+            </w:tcMar>
+            <w:vAlign w:val="center"/>
+          </w:tcPr>
+          <w:p>
+            <w:r>
+              <w:rPr>
+                <w:rFonts w:ascii="Calibri" w:cs="Calibri" w:eastAsia="Calibri" w:hAnsi="Calibri"/>
+                <w:b w:val="false"/>
+                <w:bCs w:val="false"/>
+                <w:color w:val="000000"/>
+              </w:rPr>
+              <w:t xml:space="preserve">nombreFirmante</w:t>
+            </w:r>
+          </w:p>
+        </w:tc>
+        <w:tc>
+          <w:tcPr>
+            <w:tcW w:type="dxa" w:w="4200"/>
+            <w:tcMar>
+              <w:top w:type="dxa" w:w="90"/>
+              <w:left w:type="dxa" w:w="110"/>
+              <w:bottom w:type="dxa" w:w="90"/>
+              <w:right w:type="dxa" w:w="110"/>
+            </w:tcMar>
+            <w:vAlign w:val="center"/>
+          </w:tcPr>
+          <w:p>
+            <w:r>
+              <w:rPr>
+                <w:rFonts w:ascii="Calibri" w:cs="Calibri" w:eastAsia="Calibri" w:hAnsi="Calibri"/>
+                <w:b w:val="false"/>
+                <w:bCs w:val="false"/>
+                <w:color w:val="000000"/>
+              </w:rPr>
+              <w:t xml:space="preserve">Nombre del firmante tal como quedó incrustado en la firma PAdES (campo /Name).</w:t>
+            </w:r>
+          </w:p>
+        </w:tc>
+      </w:tr>
+      <w:tr>
+        <w:trPr>
+          <w:tblHeader w:val="false"/>
+        </w:trPr>
+        <w:tc>
+          <w:tcPr>
+            <w:tcW w:type="dxa" w:w="2200"/>
+            <w:tcMar>
+              <w:top w:type="dxa" w:w="90"/>
+              <w:left w:type="dxa" w:w="110"/>
+              <w:bottom w:type="dxa" w:w="90"/>
+              <w:right w:type="dxa" w:w="110"/>
+            </w:tcMar>
+            <w:vAlign w:val="center"/>
+          </w:tcPr>
+          <w:p>
+            <w:r>
+              <w:rPr>
+                <w:rFonts w:ascii="Calibri" w:cs="Calibri" w:eastAsia="Calibri" w:hAnsi="Calibri"/>
+                <w:b w:val="false"/>
+                <w:bCs w:val="false"/>
+                <w:color w:val="000000"/>
+              </w:rPr>
+              <w:t xml:space="preserve">instanteSelloTiempo / selloTiempoAutoridad</w:t>
+            </w:r>
+          </w:p>
+        </w:tc>
+        <w:tc>
+          <w:tcPr>
+            <w:tcW w:type="dxa" w:w="4200"/>
+            <w:tcMar>
+              <w:top w:type="dxa" w:w="90"/>
+              <w:left w:type="dxa" w:w="110"/>
+              <w:bottom w:type="dxa" w:w="90"/>
+              <w:right w:type="dxa" w:w="110"/>
+            </w:tcMar>
+            <w:vAlign w:val="center"/>
+          </w:tcPr>
+          <w:p>
+            <w:r>
+              <w:rPr>
+                <w:rFonts w:ascii="Calibri" w:cs="Calibri" w:eastAsia="Calibri" w:hAnsi="Calibri"/>
+                <w:b w:val="false"/>
+                <w:bCs w:val="false"/>
+                <w:color w:val="000000"/>
+              </w:rPr>
+              <w:t xml:space="preserve">Instante y autoridad del sello de tiempo RFC 3161 embebido sobre la firma (PAdES-T) — solo si existe.</w:t>
+            </w:r>
+          </w:p>
+        </w:tc>
+      </w:tr>
+      <w:tr>
+        <w:trPr>
+          <w:tblHeader w:val="false"/>
+        </w:trPr>
+        <w:tc>
+          <w:tcPr>
+            <w:tcW w:type="dxa" w:w="2200"/>
+            <w:tcMar>
+              <w:top w:type="dxa" w:w="90"/>
+              <w:left w:type="dxa" w:w="110"/>
+              <w:bottom w:type="dxa" w:w="90"/>
+              <w:right w:type="dxa" w:w="110"/>
+            </w:tcMar>
+            <w:vAlign w:val="center"/>
+          </w:tcPr>
+          <w:p>
+            <w:r>
+              <w:rPr>
+                <w:rFonts w:ascii="Calibri" w:cs="Calibri" w:eastAsia="Calibri" w:hAnsi="Calibri"/>
+                <w:b w:val="false"/>
+                <w:bCs w:val="false"/>
+                <w:color w:val="000000"/>
+              </w:rPr>
+              <w:t xml:space="preserve">sellosDeArchivo</w:t>
+            </w:r>
+          </w:p>
+        </w:tc>
+        <w:tc>
+          <w:tcPr>
+            <w:tcW w:type="dxa" w:w="4200"/>
+            <w:tcMar>
+              <w:top w:type="dxa" w:w="90"/>
+              <w:left w:type="dxa" w:w="110"/>
+              <w:bottom w:type="dxa" w:w="90"/>
+              <w:right w:type="dxa" w:w="110"/>
+            </w:tcMar>
+            <w:vAlign w:val="center"/>
+          </w:tcPr>
+          <w:p>
+            <w:r>
+              <w:rPr>
+                <w:rFonts w:ascii="Calibri" w:cs="Calibri" w:eastAsia="Calibri" w:hAnsi="Calibri"/>
+                <w:b w:val="false"/>
+                <w:bCs w:val="false"/>
+                <w:color w:val="000000"/>
+              </w:rPr>
+              <w:t xml:space="preserve">Arreglo a nivel de documento (no por firma): sello de tiempo RFC 3161 sobre la firma y el almacén de validación a largo plazo ya embebido (PAdES-LTA), con su propio instante y autoridad.</w:t>
+            </w:r>
+          </w:p>
+        </w:tc>
+      </w:tr>
+      <w:tr>
+        <w:trPr>
+          <w:tblHeader w:val="false"/>
+        </w:trPr>
+        <w:tc>
+          <w:tcPr>
+            <w:tcW w:type="dxa" w:w="2200"/>
+            <w:tcMar>
+              <w:top w:type="dxa" w:w="90"/>
+              <w:left w:type="dxa" w:w="110"/>
+              <w:bottom w:type="dxa" w:w="90"/>
+              <w:right w:type="dxa" w:w="110"/>
+            </w:tcMar>
+            <w:vAlign w:val="center"/>
+          </w:tcPr>
+          <w:p>
+            <w:r>
+              <w:rPr>
+                <w:rFonts w:ascii="Calibri" w:cs="Calibri" w:eastAsia="Calibri" w:hAnsi="Calibri"/>
+                <w:b w:val="false"/>
+                <w:bCs w:val="false"/>
+                <w:color w:val="000000"/>
+              </w:rPr>
+              <w:t xml:space="preserve">evidencia</w:t>
+            </w:r>
+          </w:p>
+        </w:tc>
+        <w:tc>
+          <w:tcPr>
+            <w:tcW w:type="dxa" w:w="4200"/>
+            <w:tcMar>
+              <w:top w:type="dxa" w:w="90"/>
+              <w:left w:type="dxa" w:w="110"/>
+              <w:bottom w:type="dxa" w:w="90"/>
+              <w:right w:type="dxa" w:w="110"/>
+            </w:tcMar>
+            <w:vAlign w:val="center"/>
+          </w:tcPr>
+          <w:p>
+            <w:r>
+              <w:rPr>
+                <w:rFonts w:ascii="Calibri" w:cs="Calibri" w:eastAsia="Calibri" w:hAnsi="Calibri"/>
+                <w:b w:val="false"/>
+                <w:bCs w:val="false"/>
+                <w:color w:val="000000"/>
+              </w:rPr>
+              <w:t xml:space="preserve">Lista de líneas de texto, una por cada comprobación realizada (vigencia, cadena, TSL, OCSP, CRL, sello de tiempo) — pensada para mostrar o auditar, no para parsear por campo.</w:t>
             </w:r>
           </w:p>
         </w:tc>

</xml_diff>

<commit_message>
Re-audit docs/02-03-04-06 and distributable manuals against real code (RUNBOOK 12.71) (#25)
Closes the last open finding not blocked by procurement or a user
decision: docs/02 (patent) and docs/04 (business) had no stale factual
claims. docs/03 falsely claimed standalone CAdES support for generic
files/batches (not built - matrix already lists it as out of scope).
docs/06 described Gateway CORS as a permanently open dev policy, stale
since RUNBOOK 12.31 closed it by default outside Development. The
integration manual's validator field catalog was missing
sellosDeArchivo/timestamp fields and the SDK flat shortcuts, both real
since RUNBOOK 12.70/12.67 - added via direct document.xml edit,
validated structurally.

Co-authored-by: Claude Sonnet 5 <noreply@anthropic.com>
</commit_message>
<xml_diff>
--- a/docs/08-cumplimiento/manuales-distribuibles/SecureSign - Manual Tecnico de Integracion.docx
+++ b/docs/08-cumplimiento/manuales-distribuibles/SecureSign - Manual Tecnico de Integracion.docx
@@ -53,7 +53,7 @@
           <w:sz w:val="18"/>
           <w:szCs w:val="18"/>
         </w:rPr>
-        <w:t xml:space="preserve">Auditado contra el Gateway real y los controladores reales · Actualizado 2026-09-29</w:t>
+        <w:t xml:space="preserve">Auditado contra el Gateway real y los controladores reales · Actualizado 2026-10-01</w:t>
       </w:r>
     </w:p>
     <w:p>
@@ -2570,6 +2570,14 @@
         <w:spacing w:after="160"/>
       </w:pPr>
       <w:r>
+        <w:t xml:space="preserve">Los tres SDK también exponen atajos planos de un solo nivel (AutenticarAsync/EnviarDocumentoAsync/SolicitarFirmaAsync/ValidarFirmaAsync en .NET, y sus equivalentes en JavaScript/Python) que delegan directo en los métodos de recurso de arriba, sin lógica nueva — ver docs/05-integración/sdk/README.md para el detalle de ambos estilos y por qué coexisten.</w:t>
+      </w:r>
+    </w:p>
+    <w:p>
+      <w:pPr>
+        <w:spacing w:after="160"/>
+      </w:pPr>
+      <w:r>
         <w:t xml:space="preserve">Ejemplo mínimo (Python) — mismo flujo que firmar-documento.sh:</w:t>
       </w:r>
     </w:p>
@@ -3437,6 +3445,210 @@
                 <w:color w:val="000000"/>
               </w:rPr>
               <w:t xml:space="preserve">true solo si TODO lo anterior es verdadero, incluida revocación en Good.</w:t>
+            </w:r>
+          </w:p>
+        </w:tc>
+      </w:tr>
+      <w:tr>
+        <w:trPr>
+          <w:tblHeader w:val="false"/>
+        </w:trPr>
+        <w:tc>
+          <w:tcPr>
+            <w:tcW w:type="dxa" w:w="2200"/>
+            <w:tcMar>
+              <w:top w:type="dxa" w:w="90"/>
+              <w:left w:type="dxa" w:w="110"/>
+              <w:bottom w:type="dxa" w:w="90"/>
+              <w:right w:type="dxa" w:w="110"/>
+            </w:tcMar>
+            <w:vAlign w:val="center"/>
+          </w:tcPr>
+          <w:p>
+            <w:r>
+              <w:rPr>
+                <w:rFonts w:ascii="Calibri" w:cs="Calibri" w:eastAsia="Calibri" w:hAnsi="Calibri"/>
+                <w:b w:val="false"/>
+                <w:bCs w:val="false"/>
+                <w:color w:val="000000"/>
+              </w:rPr>
+              <w:t xml:space="preserve">nombreFirmante</w:t>
+            </w:r>
+          </w:p>
+        </w:tc>
+        <w:tc>
+          <w:tcPr>
+            <w:tcW w:type="dxa" w:w="4200"/>
+            <w:tcMar>
+              <w:top w:type="dxa" w:w="90"/>
+              <w:left w:type="dxa" w:w="110"/>
+              <w:bottom w:type="dxa" w:w="90"/>
+              <w:right w:type="dxa" w:w="110"/>
+            </w:tcMar>
+            <w:vAlign w:val="center"/>
+          </w:tcPr>
+          <w:p>
+            <w:r>
+              <w:rPr>
+                <w:rFonts w:ascii="Calibri" w:cs="Calibri" w:eastAsia="Calibri" w:hAnsi="Calibri"/>
+                <w:b w:val="false"/>
+                <w:bCs w:val="false"/>
+                <w:color w:val="000000"/>
+              </w:rPr>
+              <w:t xml:space="preserve">Nombre del firmante tal como quedó incrustado en la firma PAdES (campo /Name).</w:t>
+            </w:r>
+          </w:p>
+        </w:tc>
+      </w:tr>
+      <w:tr>
+        <w:trPr>
+          <w:tblHeader w:val="false"/>
+        </w:trPr>
+        <w:tc>
+          <w:tcPr>
+            <w:tcW w:type="dxa" w:w="2200"/>
+            <w:tcMar>
+              <w:top w:type="dxa" w:w="90"/>
+              <w:left w:type="dxa" w:w="110"/>
+              <w:bottom w:type="dxa" w:w="90"/>
+              <w:right w:type="dxa" w:w="110"/>
+            </w:tcMar>
+            <w:vAlign w:val="center"/>
+          </w:tcPr>
+          <w:p>
+            <w:r>
+              <w:rPr>
+                <w:rFonts w:ascii="Calibri" w:cs="Calibri" w:eastAsia="Calibri" w:hAnsi="Calibri"/>
+                <w:b w:val="false"/>
+                <w:bCs w:val="false"/>
+                <w:color w:val="000000"/>
+              </w:rPr>
+              <w:t xml:space="preserve">instanteSelloTiempo / selloTiempoAutoridad</w:t>
+            </w:r>
+          </w:p>
+        </w:tc>
+        <w:tc>
+          <w:tcPr>
+            <w:tcW w:type="dxa" w:w="4200"/>
+            <w:tcMar>
+              <w:top w:type="dxa" w:w="90"/>
+              <w:left w:type="dxa" w:w="110"/>
+              <w:bottom w:type="dxa" w:w="90"/>
+              <w:right w:type="dxa" w:w="110"/>
+            </w:tcMar>
+            <w:vAlign w:val="center"/>
+          </w:tcPr>
+          <w:p>
+            <w:r>
+              <w:rPr>
+                <w:rFonts w:ascii="Calibri" w:cs="Calibri" w:eastAsia="Calibri" w:hAnsi="Calibri"/>
+                <w:b w:val="false"/>
+                <w:bCs w:val="false"/>
+                <w:color w:val="000000"/>
+              </w:rPr>
+              <w:t xml:space="preserve">Instante y autoridad del sello de tiempo RFC 3161 embebido sobre la firma (PAdES-T) — solo si existe.</w:t>
+            </w:r>
+          </w:p>
+        </w:tc>
+      </w:tr>
+      <w:tr>
+        <w:trPr>
+          <w:tblHeader w:val="false"/>
+        </w:trPr>
+        <w:tc>
+          <w:tcPr>
+            <w:tcW w:type="dxa" w:w="2200"/>
+            <w:tcMar>
+              <w:top w:type="dxa" w:w="90"/>
+              <w:left w:type="dxa" w:w="110"/>
+              <w:bottom w:type="dxa" w:w="90"/>
+              <w:right w:type="dxa" w:w="110"/>
+            </w:tcMar>
+            <w:vAlign w:val="center"/>
+          </w:tcPr>
+          <w:p>
+            <w:r>
+              <w:rPr>
+                <w:rFonts w:ascii="Calibri" w:cs="Calibri" w:eastAsia="Calibri" w:hAnsi="Calibri"/>
+                <w:b w:val="false"/>
+                <w:bCs w:val="false"/>
+                <w:color w:val="000000"/>
+              </w:rPr>
+              <w:t xml:space="preserve">sellosDeArchivo</w:t>
+            </w:r>
+          </w:p>
+        </w:tc>
+        <w:tc>
+          <w:tcPr>
+            <w:tcW w:type="dxa" w:w="4200"/>
+            <w:tcMar>
+              <w:top w:type="dxa" w:w="90"/>
+              <w:left w:type="dxa" w:w="110"/>
+              <w:bottom w:type="dxa" w:w="90"/>
+              <w:right w:type="dxa" w:w="110"/>
+            </w:tcMar>
+            <w:vAlign w:val="center"/>
+          </w:tcPr>
+          <w:p>
+            <w:r>
+              <w:rPr>
+                <w:rFonts w:ascii="Calibri" w:cs="Calibri" w:eastAsia="Calibri" w:hAnsi="Calibri"/>
+                <w:b w:val="false"/>
+                <w:bCs w:val="false"/>
+                <w:color w:val="000000"/>
+              </w:rPr>
+              <w:t xml:space="preserve">Arreglo a nivel de documento (no por firma): sello de tiempo RFC 3161 sobre la firma y el almacén de validación a largo plazo ya embebido (PAdES-LTA), con su propio instante y autoridad.</w:t>
+            </w:r>
+          </w:p>
+        </w:tc>
+      </w:tr>
+      <w:tr>
+        <w:trPr>
+          <w:tblHeader w:val="false"/>
+        </w:trPr>
+        <w:tc>
+          <w:tcPr>
+            <w:tcW w:type="dxa" w:w="2200"/>
+            <w:tcMar>
+              <w:top w:type="dxa" w:w="90"/>
+              <w:left w:type="dxa" w:w="110"/>
+              <w:bottom w:type="dxa" w:w="90"/>
+              <w:right w:type="dxa" w:w="110"/>
+            </w:tcMar>
+            <w:vAlign w:val="center"/>
+          </w:tcPr>
+          <w:p>
+            <w:r>
+              <w:rPr>
+                <w:rFonts w:ascii="Calibri" w:cs="Calibri" w:eastAsia="Calibri" w:hAnsi="Calibri"/>
+                <w:b w:val="false"/>
+                <w:bCs w:val="false"/>
+                <w:color w:val="000000"/>
+              </w:rPr>
+              <w:t xml:space="preserve">evidencia</w:t>
+            </w:r>
+          </w:p>
+        </w:tc>
+        <w:tc>
+          <w:tcPr>
+            <w:tcW w:type="dxa" w:w="4200"/>
+            <w:tcMar>
+              <w:top w:type="dxa" w:w="90"/>
+              <w:left w:type="dxa" w:w="110"/>
+              <w:bottom w:type="dxa" w:w="90"/>
+              <w:right w:type="dxa" w:w="110"/>
+            </w:tcMar>
+            <w:vAlign w:val="center"/>
+          </w:tcPr>
+          <w:p>
+            <w:r>
+              <w:rPr>
+                <w:rFonts w:ascii="Calibri" w:cs="Calibri" w:eastAsia="Calibri" w:hAnsi="Calibri"/>
+                <w:b w:val="false"/>
+                <w:bCs w:val="false"/>
+                <w:color w:val="000000"/>
+              </w:rPr>
+              <w:t xml:space="preserve">Lista de líneas de texto, una por cada comprobación realizada (vigencia, cadena, TSL, OCSP, CRL, sello de tiempo) — pensada para mostrar o auditar, no para parsear por campo.</w:t>
             </w:r>
           </w:p>
         </w:tc>

</xml_diff>